<commit_message>
docs(pruebas): corrige portada y ejecución del informe del 05-10
- Autores: Edgar Tolentino y Miguel Ortega.
- «Ejecutado por»: Lian Grandón, con apoyo de un asistente de IA.
- Título de las propiedades sin «Manuales», igual que la portada.
- Pies de foto de PT-03 y PT-08 aclaran que reutilizan capturas.
- Se borra el informe del 28-09: sus capturas no salían de Prism.
  Queda en el historial de git.

Parte del #80.

Co-Authored-By: Claude Opus 5.5 <noreply@anthropic.com>
</commit_message>
<xml_diff>
--- a/Fase 2/Evidencias Proyecto/Evidencias de documentacion/Pruebas/Reporte_Pruebas_Guardian_EPP_05_10_2026.docx
+++ b/Fase 2/Evidencias Proyecto/Evidencias de documentacion/Pruebas/Reporte_Pruebas_Guardian_EPP_05_10_2026.docx
@@ -216,14 +216,14 @@
         <w:rPr>
           <w:color w:val="000000" w:themeColor="text1"/>
         </w:rPr>
-        <w:t>Edgard Tolentino</w:t>
+        <w:t>Edgar Tolentino</w:t>
       </w:r>
       <w:r>
         <w:rPr>
           <w:color w:val="000000" w:themeColor="text1"/>
         </w:rPr>
         <w:br/>
-        <w:t>Matías Ortega</w:t>
+        <w:t>Miguel Ortega</w:t>
       </w:r>
       <w:r>
         <w:rPr>
@@ -351,7 +351,7 @@
         <w:rPr>
           <w:color w:val="000000" w:themeColor="text1"/>
         </w:rPr>
-        <w:t>Ejecutado por: sesión de verificación del equipo Guardián EPP, con apoyo de un asistente de IA.</w:t>
+        <w:t>Ejecutado por: Lian Grandón, con apoyo de un asistente de IA.</w:t>
       </w:r>
     </w:p>
     <w:p>
@@ -1901,7 +1901,7 @@
           <w:color w:val="000000" w:themeColor="text1"/>
           <w:sz w:val="18"/>
         </w:rPr>
-        <w:t>El mock vuelve a mostrar H-2411 y el contador original tras recargar.</w:t>
+        <w:t>Se reutiliza la captura de PT-01: al recargar, la bandeja vuelve al mismo estado de ejemplo porque Prism no conserva la decisión.</w:t>
       </w:r>
     </w:p>
     <w:p>
@@ -3321,7 +3321,7 @@
           <w:color w:val="000000" w:themeColor="text1"/>
           <w:sz w:val="18"/>
         </w:rPr>
-        <w:t>Prism expone las acciones de triage; no es una sesión de solo lectura.</w:t>
+        <w:t>Prism expone las acciones de triage; no es una sesión de solo lectura (misma captura de PT-02).</w:t>
       </w:r>
     </w:p>
     <w:p>

</xml_diff>